<commit_message>
Printouts and e-mails in the BankFas identity (ADR 0055 second step, docs/56 §5)
One print style (PrintStyle) for the terms, the proforma, the request print and the
reports: Plex fonts, vault headings over an emerald rule, mono figures. The API image
installs the font files for Chromium's PDF; the site serves them at /fonts. The SMTP
sender adds an HTML part (MailHtml) built from the text alone, with its tests.

Co-Authored-By: Claude Opus 5.5 <noreply@anthropic.com>
Claude-Session: https://claude.ai/code/session_012HHcRrzuvMBTL2FYxXtsyv
</commit_message>
<xml_diff>
--- a/treasury-platform/docs/56-VISUAL-IDENTITY.docx
+++ b/treasury-platform/docs/56-VISUAL-IDENTITY.docx
@@ -1035,7 +1035,28 @@
             <w:szCs w:val="20"/>
             <w:rtl/>
           </w:rPr>
-          <w:t xml:space="preserve">5. ما بقي</w:t>
+          <w:t xml:space="preserve">5. المطبوعات والبريد (الدفعة الثانية)</w:t>
+        </w:r>
+      </w:hyperlink>
+    </w:p>
+    <w:p>
+      <w:pPr>
+        <w:bidi/>
+        <w:spacing w:after="50" w:before="0"/>
+        <w:ind w:left="0"/>
+      </w:pPr>
+      <w:hyperlink w:history="1" w:anchor="_sec6">
+        <w:r>
+          <w:rPr>
+            <w:rFonts w:ascii="Arial" w:cs="Arial" w:eastAsia="Arial" w:hAnsi="Arial"/>
+            <w:b/>
+            <w:bCs/>
+            <w:color w:val="1F3A5F"/>
+            <w:sz w:val="20"/>
+            <w:szCs w:val="20"/>
+            <w:rtl/>
+          </w:rPr>
+          <w:t xml:space="preserve">6. ما بقي</w:t>
         </w:r>
       </w:hyperlink>
     </w:p>
@@ -1710,7 +1731,7 @@
           <w:szCs w:val="32"/>
           <w:rtl/>
         </w:rPr>
-        <w:t xml:space="preserve">5. ما بقي</w:t>
+        <w:t xml:space="preserve">5. المطبوعات والبريد (الدفعة الثانية)</w:t>
       </w:r>
       <w:bookmarkEnd w:id="5"/>
     </w:p>
@@ -1733,18 +1754,90 @@
           <w:szCs w:val="21"/>
           <w:rtl/>
         </w:rPr>
-        <w:t xml:space="preserve">المطبوعات</w:t>
-      </w:r>
-      <w:r>
-        <w:rPr>
-          <w:rFonts w:ascii="Arial" w:cs="Arial" w:eastAsia="Arial" w:hAnsi="Arial"/>
-          <w:b w:val="false"/>
-          <w:bCs w:val="false"/>
-          <w:sz w:val="21"/>
-          <w:szCs w:val="21"/>
-          <w:rtl/>
-        </w:rPr>
-        <w:t xml:space="preserve"> (شروط الاعتماد، والفاتورة المبدئية، وطباعة الطلب، والتقارير بصيغة PDF): لها أنماطها الخاصة. نقلها إلى الهوية، بغلاف أخضر الخزنة كما في ص 24، خطوة لاحقة.</w:t>
+        <w:t xml:space="preserve">المطبوعات:</w:t>
+      </w:r>
+      <w:r>
+        <w:rPr>
+          <w:rFonts w:ascii="Arial" w:cs="Arial" w:eastAsia="Arial" w:hAnsi="Arial"/>
+          <w:b w:val="false"/>
+          <w:bCs w:val="false"/>
+          <w:sz w:val="21"/>
+          <w:szCs w:val="21"/>
+          <w:rtl/>
+        </w:rPr>
+        <w:t xml:space="preserve"> شروط الاعتماد، والفاتورة المبدئية، وطباعة الطلب، والتقارير بصيغتيها HTML وPDF. صارت كلها بخطوط Plex، والعناوين بأخضر الخزنة فوق خط زمردي، ورؤوس الجداول بالرمادي الفاتح، والأرقام بخط Mono. التنسيق مشترك في ملف واحد: </w:t>
+      </w:r>
+      <w:r>
+        <w:rPr>
+          <w:rFonts w:ascii="Courier New" w:cs="Courier New" w:eastAsia="Courier New" w:hAnsi="Courier New"/>
+          <w:b w:val="false"/>
+          <w:bCs w:val="false"/>
+          <w:color w:val="1F2937"/>
+          <w:sz w:val="18"/>
+          <w:szCs w:val="18"/>
+          <w:shd w:fill="F1F3F5" w:color="auto" w:val="clear"/>
+          <w:rtl/>
+        </w:rPr>
+        <w:t xml:space="preserve">‎PrintStyle‎</w:t>
+      </w:r>
+      <w:r>
+        <w:rPr>
+          <w:rFonts w:ascii="Arial" w:cs="Arial" w:eastAsia="Arial" w:hAnsi="Arial"/>
+          <w:b w:val="false"/>
+          <w:bCs w:val="false"/>
+          <w:sz w:val="21"/>
+          <w:szCs w:val="21"/>
+          <w:rtl/>
+        </w:rPr>
+        <w:t xml:space="preserve"> في </w:t>
+      </w:r>
+      <w:r>
+        <w:rPr>
+          <w:rFonts w:ascii="Courier New" w:cs="Courier New" w:eastAsia="Courier New" w:hAnsi="Courier New"/>
+          <w:b w:val="false"/>
+          <w:bCs w:val="false"/>
+          <w:color w:val="1F2937"/>
+          <w:sz w:val="18"/>
+          <w:szCs w:val="18"/>
+          <w:shd w:fill="F1F3F5" w:color="auto" w:val="clear"/>
+          <w:rtl/>
+        </w:rPr>
+        <w:t xml:space="preserve">‎BankFas.Data‎</w:t>
+      </w:r>
+      <w:r>
+        <w:rPr>
+          <w:rFonts w:ascii="Arial" w:cs="Arial" w:eastAsia="Arial" w:hAnsi="Arial"/>
+          <w:b w:val="false"/>
+          <w:bCs w:val="false"/>
+          <w:sz w:val="21"/>
+          <w:szCs w:val="21"/>
+          <w:rtl/>
+        </w:rPr>
+        <w:t xml:space="preserve">. صورة النشر تثبّت الخطوط نفسها ليستعملها Chromium عند إخراج PDF، والمتصفح يجلبها من </w:t>
+      </w:r>
+      <w:r>
+        <w:rPr>
+          <w:rFonts w:ascii="Courier New" w:cs="Courier New" w:eastAsia="Courier New" w:hAnsi="Courier New"/>
+          <w:b w:val="false"/>
+          <w:bCs w:val="false"/>
+          <w:color w:val="1F2937"/>
+          <w:sz w:val="18"/>
+          <w:szCs w:val="18"/>
+          <w:shd w:fill="F1F3F5" w:color="auto" w:val="clear"/>
+          <w:rtl/>
+        </w:rPr>
+        <w:t xml:space="preserve">‎/fonts‎</w:t>
+      </w:r>
+      <w:r>
+        <w:rPr>
+          <w:rFonts w:ascii="Arial" w:cs="Arial" w:eastAsia="Arial" w:hAnsi="Arial"/>
+          <w:b w:val="false"/>
+          <w:bCs w:val="false"/>
+          <w:sz w:val="21"/>
+          <w:szCs w:val="21"/>
+          <w:rtl/>
+        </w:rPr>
+        <w:t xml:space="preserve"> في الموقع.</w:t>
       </w:r>
     </w:p>
     <w:p>
@@ -1766,18 +1859,18 @@
           <w:szCs w:val="21"/>
           <w:rtl/>
         </w:rPr>
-        <w:t xml:space="preserve">قوالب البريد الإلكتروني</w:t>
-      </w:r>
-      <w:r>
-        <w:rPr>
-          <w:rFonts w:ascii="Arial" w:cs="Arial" w:eastAsia="Arial" w:hAnsi="Arial"/>
-          <w:b w:val="false"/>
-          <w:bCs w:val="false"/>
-          <w:sz w:val="21"/>
-          <w:szCs w:val="21"/>
-          <w:rtl/>
-        </w:rPr>
-        <w:t xml:space="preserve">: ما زالت نصًا بسيطًا.</w:t>
+        <w:t xml:space="preserve">الفاتورة المبدئية</w:t>
+      </w:r>
+      <w:r>
+        <w:rPr>
+          <w:rFonts w:ascii="Arial" w:cs="Arial" w:eastAsia="Arial" w:hAnsi="Arial"/>
+          <w:b w:val="false"/>
+          <w:bCs w:val="false"/>
+          <w:sz w:val="21"/>
+          <w:szCs w:val="21"/>
+          <w:rtl/>
+        </w:rPr>
+        <w:t xml:space="preserve"> مستند الشركة المشتركة إلى عميلها. لذلك أخذت الخطوط والألوان فقط، وليس عليها شعار BankFas.</w:t>
       </w:r>
     </w:p>
     <w:p>
@@ -1799,6 +1892,203 @@
           <w:szCs w:val="21"/>
           <w:rtl/>
         </w:rPr>
+        <w:t xml:space="preserve">البريد الإلكتروني:</w:t>
+      </w:r>
+      <w:r>
+        <w:rPr>
+          <w:rFonts w:ascii="Arial" w:cs="Arial" w:eastAsia="Arial" w:hAnsi="Arial"/>
+          <w:b w:val="false"/>
+          <w:bCs w:val="false"/>
+          <w:sz w:val="21"/>
+          <w:szCs w:val="21"/>
+          <w:rtl/>
+        </w:rPr>
+        <w:t xml:space="preserve"> كل رسالة صار لها نسخة HTML بجانب النص: شريط أخضر الخزنة فيه اسم BANKFAS نصًا لا صورة، فيظهر حتى إن حجب البريد الصور. ثم النص، ثم الرابط زرًا، ثم تذييل العلامة. والاتجاه يُحدَّد من لغة الرسالة. وتبقى النسخة النصية لمن لا يعرض HTML.</w:t>
+      </w:r>
+    </w:p>
+    <w:p>
+      <w:pPr>
+        <w:bidi/>
+        <w:spacing w:after="60" w:before="0"/>
+      </w:pPr>
+    </w:p>
+    <w:p>
+      <w:pPr>
+        <w:keepNext/>
+        <w:bidi/>
+        <w:spacing w:after="60" w:before="160"/>
+        <w:jc w:val="center"/>
+      </w:pPr>
+      <w:r>
+        <w:drawing>
+          <wp:inline distT="0" distB="0" distL="0" distR="0">
+            <wp:extent cx="6096000" cy="4610100"/>
+            <wp:effectExtent t="0" r="0" b="0" l="0"/>
+            <wp:docPr id="1" name="diagrams/brand/print-ar.png" descr="طباعة الشروط" title="طباعة الشروط"/>
+            <wp:cNvGraphicFramePr>
+              <a:graphicFrameLocks xmlns:a="http://schemas.openxmlformats.org/drawingml/2006/main" noChangeAspect="1"/>
+            </wp:cNvGraphicFramePr>
+            <a:graphic xmlns:a="http://schemas.openxmlformats.org/drawingml/2006/main">
+              <a:graphicData uri="http://schemas.openxmlformats.org/drawingml/2006/picture">
+                <pic:pic xmlns:pic="http://schemas.openxmlformats.org/drawingml/2006/picture">
+                  <pic:nvPicPr>
+                    <pic:cNvPr id="0" name="" descr=""/>
+                    <pic:cNvPicPr>
+                      <a:picLocks noChangeAspect="1" noChangeArrowheads="1"/>
+                    </pic:cNvPicPr>
+                  </pic:nvPicPr>
+                  <pic:blipFill>
+                    <a:blip r:embed="rId13" cstate="none"/>
+                    <a:srcRect/>
+                    <a:stretch>
+                      <a:fillRect/>
+                    </a:stretch>
+                  </pic:blipFill>
+                  <pic:spPr bwMode="auto">
+                    <a:xfrm>
+                      <a:off x="0" y="0"/>
+                      <a:ext cx="6096000" cy="4610100"/>
+                    </a:xfrm>
+                    <a:prstGeom prst="rect">
+                      <a:avLst/>
+                    </a:prstGeom>
+                  </pic:spPr>
+                </pic:pic>
+              </a:graphicData>
+            </a:graphic>
+          </wp:inline>
+        </w:drawing>
+      </w:r>
+    </w:p>
+    <w:p>
+      <w:pPr>
+        <w:bidi/>
+        <w:spacing w:after="220" w:before="0"/>
+        <w:jc w:val="center"/>
+      </w:pPr>
+      <w:r>
+        <w:rPr>
+          <w:rFonts w:ascii="Arial" w:cs="Arial" w:eastAsia="Arial" w:hAnsi="Arial"/>
+          <w:b w:val="false"/>
+          <w:bCs w:val="false"/>
+          <w:i/>
+          <w:iCs/>
+          <w:color w:val="5B6670"/>
+          <w:sz w:val="17"/>
+          <w:szCs w:val="17"/>
+          <w:rtl/>
+        </w:rPr>
+        <w:t xml:space="preserve">طباعة الشروط</w:t>
+      </w:r>
+    </w:p>
+    <w:p>
+      <w:pPr>
+        <w:keepNext/>
+        <w:bidi/>
+        <w:spacing w:after="60" w:before="160"/>
+        <w:jc w:val="center"/>
+      </w:pPr>
+      <w:r>
+        <w:drawing>
+          <wp:inline distT="0" distB="0" distL="0" distR="0">
+            <wp:extent cx="6096000" cy="4876800"/>
+            <wp:effectExtent t="0" r="0" b="0" l="0"/>
+            <wp:docPr id="1" name="diagrams/brand/mail-ar.png" descr="رسالة دعوة" title="رسالة دعوة"/>
+            <wp:cNvGraphicFramePr>
+              <a:graphicFrameLocks xmlns:a="http://schemas.openxmlformats.org/drawingml/2006/main" noChangeAspect="1"/>
+            </wp:cNvGraphicFramePr>
+            <a:graphic xmlns:a="http://schemas.openxmlformats.org/drawingml/2006/main">
+              <a:graphicData uri="http://schemas.openxmlformats.org/drawingml/2006/picture">
+                <pic:pic xmlns:pic="http://schemas.openxmlformats.org/drawingml/2006/picture">
+                  <pic:nvPicPr>
+                    <pic:cNvPr id="0" name="" descr=""/>
+                    <pic:cNvPicPr>
+                      <a:picLocks noChangeAspect="1" noChangeArrowheads="1"/>
+                    </pic:cNvPicPr>
+                  </pic:nvPicPr>
+                  <pic:blipFill>
+                    <a:blip r:embed="rId14" cstate="none"/>
+                    <a:srcRect/>
+                    <a:stretch>
+                      <a:fillRect/>
+                    </a:stretch>
+                  </pic:blipFill>
+                  <pic:spPr bwMode="auto">
+                    <a:xfrm>
+                      <a:off x="0" y="0"/>
+                      <a:ext cx="6096000" cy="4876800"/>
+                    </a:xfrm>
+                    <a:prstGeom prst="rect">
+                      <a:avLst/>
+                    </a:prstGeom>
+                  </pic:spPr>
+                </pic:pic>
+              </a:graphicData>
+            </a:graphic>
+          </wp:inline>
+        </w:drawing>
+      </w:r>
+    </w:p>
+    <w:p>
+      <w:pPr>
+        <w:bidi/>
+        <w:spacing w:after="220" w:before="0"/>
+        <w:jc w:val="center"/>
+      </w:pPr>
+      <w:r>
+        <w:rPr>
+          <w:rFonts w:ascii="Arial" w:cs="Arial" w:eastAsia="Arial" w:hAnsi="Arial"/>
+          <w:b w:val="false"/>
+          <w:bCs w:val="false"/>
+          <w:i/>
+          <w:iCs/>
+          <w:color w:val="5B6670"/>
+          <w:sz w:val="17"/>
+          <w:szCs w:val="17"/>
+          <w:rtl/>
+        </w:rPr>
+        <w:t xml:space="preserve">رسالة دعوة</w:t>
+      </w:r>
+    </w:p>
+    <w:p>
+      <w:pPr>
+        <w:pStyle w:val="Heading1"/>
+        <w:bidi/>
+      </w:pPr>
+      <w:bookmarkStart w:name="_sec6" w:id="6"/>
+      <w:r>
+        <w:rPr>
+          <w:rFonts w:ascii="Arial" w:cs="Arial" w:eastAsia="Arial" w:hAnsi="Arial"/>
+          <w:b/>
+          <w:bCs/>
+          <w:color w:val="1F3A5F"/>
+          <w:sz w:val="32"/>
+          <w:szCs w:val="32"/>
+          <w:rtl/>
+        </w:rPr>
+        <w:t xml:space="preserve">6. ما بقي</w:t>
+      </w:r>
+      <w:bookmarkEnd w:id="6"/>
+    </w:p>
+    <w:p>
+      <w:pPr>
+        <w:pStyle w:val="ListParagraph"/>
+        <w:numPr>
+          <w:ilvl w:val="0"/>
+          <w:numId w:val="2"/>
+        </w:numPr>
+        <w:bidi/>
+        <w:spacing w:after="70" w:before="0" w:line="300"/>
+      </w:pPr>
+      <w:r>
+        <w:rPr>
+          <w:rFonts w:ascii="Arial" w:cs="Arial" w:eastAsia="Arial" w:hAnsi="Arial"/>
+          <w:b/>
+          <w:bCs/>
+          <w:sz w:val="21"/>
+          <w:szCs w:val="21"/>
+          <w:rtl/>
+        </w:rPr>
         <w:t xml:space="preserve">ملف SVG الرسمي للشعار</w:t>
       </w:r>
       <w:r>
@@ -1835,6 +2125,39 @@
           <w:rtl/>
         </w:rPr>
         <w:t xml:space="preserve"> دون أي تغيير آخر.</w:t>
+      </w:r>
+    </w:p>
+    <w:p>
+      <w:pPr>
+        <w:pStyle w:val="ListParagraph"/>
+        <w:numPr>
+          <w:ilvl w:val="0"/>
+          <w:numId w:val="2"/>
+        </w:numPr>
+        <w:bidi/>
+        <w:spacing w:after="70" w:before="0" w:line="300"/>
+      </w:pPr>
+      <w:r>
+        <w:rPr>
+          <w:rFonts w:ascii="Arial" w:cs="Arial" w:eastAsia="Arial" w:hAnsi="Arial"/>
+          <w:b/>
+          <w:bCs/>
+          <w:sz w:val="21"/>
+          <w:szCs w:val="21"/>
+          <w:rtl/>
+        </w:rPr>
+        <w:t xml:space="preserve">غلاف تقرير التقييم الائتماني</w:t>
+      </w:r>
+      <w:r>
+        <w:rPr>
+          <w:rFonts w:ascii="Arial" w:cs="Arial" w:eastAsia="Arial" w:hAnsi="Arial"/>
+          <w:b w:val="false"/>
+          <w:bCs w:val="false"/>
+          <w:sz w:val="21"/>
+          <w:szCs w:val="21"/>
+          <w:rtl/>
+        </w:rPr>
+        <w:t xml:space="preserve"> بأخضر الخزنة ونمط الشقوق (ص 24): يُبنى مع شاشة طباعة تقرير التقييم حين تُطلب.</w:t>
       </w:r>
     </w:p>
     <w:p>

</xml_diff>